<commit_message>
Report: add student name
</commit_message>
<xml_diff>
--- a/docs/MLOps_Assignment1_Report.docx
+++ b/docs/MLOps_Assignment1_Report.docx
@@ -117,7 +117,7 @@
                 <w:sz w:val="18"/>
                 <w:szCs w:val="18"/>
               </w:rPr>
-              <w:t xml:space="preserve"/>
+              <w:t xml:space="preserve">Submission details</w:t>
             </w:r>
           </w:p>
         </w:tc>
@@ -216,7 +216,7 @@
                 <w:sz w:val="18"/>
                 <w:szCs w:val="18"/>
               </w:rPr>
-              <w:t xml:space="preserve">[Your Name]</w:t>
+              <w:t xml:space="preserve">Gaurisha Mathur</w:t>
             </w:r>
           </w:p>
         </w:tc>

</xml_diff>

<commit_message>
Point repository links to 2025ae05642/heart-disease-mlops
</commit_message>
<xml_diff>
--- a/docs/MLOps_Assignment1_Report.docx
+++ b/docs/MLOps_Assignment1_Report.docx
@@ -348,7 +348,7 @@
                 <w:sz w:val="18"/>
                 <w:szCs w:val="18"/>
               </w:rPr>
-              <w:t xml:space="preserve">https://github.com/flow-shiftt/heart-disease-mlops</w:t>
+              <w:t xml:space="preserve">https://github.com/2025ae05642/heart-disease-mlops</w:t>
             </w:r>
           </w:p>
         </w:tc>
@@ -1820,7 +1820,7 @@
           <w:sz w:val="17"/>
           <w:szCs w:val="17"/>
         </w:rPr>
-        <w:t xml:space="preserve">git clone https://github.com/flow-shiftt/heart-disease-mlops.git &amp;&amp; cd heart-disease-mlops</w:t>
+        <w:t xml:space="preserve">git clone https://github.com/2025ae05642/heart-disease-mlops.git &amp;&amp; cd heart-disease-mlops</w:t>
       </w:r>
     </w:p>
     <w:p>
@@ -9156,7 +9156,7 @@
                 <w:sz w:val="18"/>
                 <w:szCs w:val="18"/>
               </w:rPr>
-              <w:t xml:space="preserve">https://github.com/flow-shiftt/heart-disease-mlops</w:t>
+              <w:t xml:space="preserve">https://github.com/2025ae05642/heart-disease-mlops</w:t>
             </w:r>
           </w:p>
         </w:tc>

</xml_diff>

<commit_message>
Rename tests/ to test/ per deliverables; tidy notebook paths; README access options
</commit_message>
<xml_diff>
--- a/docs/MLOps_Assignment1_Report.docx
+++ b/docs/MLOps_Assignment1_Report.docx
@@ -1986,7 +1986,7 @@
           <w:sz w:val="19"/>
           <w:szCs w:val="19"/>
         </w:rPr>
-        <w:t xml:space="preserve">tests/</w:t>
+        <w:t xml:space="preserve">test/</w:t>
       </w:r>
       <w:r>
         <w:t xml:space="preserve">, </w:t>
@@ -9420,7 +9420,7 @@
                 <w:sz w:val="18"/>
                 <w:szCs w:val="18"/>
               </w:rPr>
-              <w:t xml:space="preserve">tests/ (26 tests)</w:t>
+              <w:t xml:space="preserve">test/ (26 tests)</w:t>
             </w:r>
           </w:p>
         </w:tc>

</xml_diff>